<commit_message>
Added well archicture framework
</commit_message>
<xml_diff>
--- a/src/main/java/com/pankaj/document/HLD.docx
+++ b/src/main/java/com/pankaj/document/HLD.docx
@@ -12,134 +12,912 @@
         </w:numPr>
       </w:pPr>
       <w:r>
-        <w:rPr>
-          <w:b/>
-        </w:rPr>
-        <w:t>Strangler Patter</w:t>
-      </w:r>
-      <w:r>
-        <w:rPr>
-          <w:b/>
-        </w:rPr>
-        <w:t>n</w:t>
-      </w:r>
-      <w:r>
-        <w:t xml:space="preserve">: Strangler pattern is nothing but just to strange from </w:t>
-      </w:r>
-      <w:proofErr w:type="spellStart"/>
-      <w:r>
-        <w:t>Monolothic</w:t>
-      </w:r>
-      <w:proofErr w:type="spellEnd"/>
-      <w:r>
-        <w:t xml:space="preserve"> to </w:t>
-      </w:r>
-      <w:proofErr w:type="spellStart"/>
-      <w:r>
-        <w:t>microservices</w:t>
-      </w:r>
-      <w:proofErr w:type="spellEnd"/>
-      <w:r>
-        <w:t>.</w:t>
+        <w:t>Well Architecture Framework</w:t>
+      </w:r>
+    </w:p>
+    <w:p>
+      <w:pPr>
+        <w:pStyle w:val="ListParagraph"/>
+        <w:numPr>
+          <w:ilvl w:val="0"/>
+          <w:numId w:val="11"/>
+        </w:numPr>
+      </w:pPr>
+      <w:r>
+        <w:t>Operational Excellence</w:t>
+      </w:r>
+    </w:p>
+    <w:p>
+      <w:pPr>
+        <w:pStyle w:val="ListParagraph"/>
+        <w:numPr>
+          <w:ilvl w:val="0"/>
+          <w:numId w:val="11"/>
+        </w:numPr>
+      </w:pPr>
+      <w:r>
+        <w:t>Security</w:t>
+      </w:r>
+    </w:p>
+    <w:p>
+      <w:pPr>
+        <w:pStyle w:val="ListParagraph"/>
+        <w:numPr>
+          <w:ilvl w:val="0"/>
+          <w:numId w:val="11"/>
+        </w:numPr>
+      </w:pPr>
+      <w:r>
+        <w:t>Reliability</w:t>
+      </w:r>
+    </w:p>
+    <w:p>
+      <w:pPr>
+        <w:pStyle w:val="ListParagraph"/>
+        <w:numPr>
+          <w:ilvl w:val="0"/>
+          <w:numId w:val="11"/>
+        </w:numPr>
+      </w:pPr>
+      <w:r>
+        <w:t>Performance Efficiency</w:t>
+      </w:r>
+    </w:p>
+    <w:p>
+      <w:pPr>
+        <w:pStyle w:val="ListParagraph"/>
+        <w:numPr>
+          <w:ilvl w:val="0"/>
+          <w:numId w:val="11"/>
+        </w:numPr>
+      </w:pPr>
+      <w:r>
+        <w:t>Cost Optimization</w:t>
+      </w:r>
+    </w:p>
+    <w:p>
+      <w:pPr>
+        <w:pStyle w:val="ListParagraph"/>
+        <w:numPr>
+          <w:ilvl w:val="0"/>
+          <w:numId w:val="11"/>
+        </w:numPr>
+      </w:pPr>
+      <w:r>
+        <w:t>Sustainability</w:t>
+      </w:r>
+    </w:p>
+    <w:p>
+      <w:pPr>
+        <w:pStyle w:val="ListParagraph"/>
+        <w:ind w:left="1080"/>
+      </w:pPr>
+    </w:p>
+    <w:p>
+      <w:pPr>
+        <w:pStyle w:val="ListParagraph"/>
+        <w:numPr>
+          <w:ilvl w:val="1"/>
+          <w:numId w:val="1"/>
+        </w:numPr>
+        <w:rPr>
+          <w:b/>
+        </w:rPr>
+      </w:pPr>
+      <w:r>
+        <w:rPr>
+          <w:b/>
+        </w:rPr>
+        <w:t xml:space="preserve">Operational </w:t>
+      </w:r>
+      <w:r>
+        <w:rPr>
+          <w:b/>
+        </w:rPr>
+        <w:t>Excellence:</w:t>
+      </w:r>
+      <w:r>
+        <w:rPr>
+          <w:b/>
+        </w:rPr>
+        <w:t xml:space="preserve"> </w:t>
+      </w:r>
+      <w:r>
+        <w:t>The operational Excellence pillar include the ability to support development and run workloads effectively, gain insight into their operation, and continuously improve supporting processes and procedures to delivery business value.</w:t>
+      </w:r>
+    </w:p>
+    <w:p>
+      <w:pPr>
+        <w:pStyle w:val="ListParagraph"/>
+        <w:numPr>
+          <w:ilvl w:val="3"/>
+          <w:numId w:val="14"/>
+        </w:numPr>
+        <w:rPr>
+          <w:b/>
+        </w:rPr>
+      </w:pPr>
+      <w:r>
+        <w:rPr>
+          <w:b/>
+        </w:rPr>
+        <w:t xml:space="preserve">Design Principles: </w:t>
+      </w:r>
+    </w:p>
+    <w:p>
+      <w:pPr>
+        <w:pStyle w:val="ListParagraph"/>
+        <w:numPr>
+          <w:ilvl w:val="6"/>
+          <w:numId w:val="15"/>
+        </w:numPr>
+      </w:pPr>
+      <w:r>
+        <w:t xml:space="preserve">Perform </w:t>
+      </w:r>
+      <w:r>
+        <w:t>Operations as code</w:t>
+      </w:r>
+    </w:p>
+    <w:p>
+      <w:pPr>
+        <w:pStyle w:val="ListParagraph"/>
+        <w:numPr>
+          <w:ilvl w:val="6"/>
+          <w:numId w:val="15"/>
+        </w:numPr>
+      </w:pPr>
+      <w:r>
+        <w:t>Make frequent, small, reversible changes</w:t>
+      </w:r>
+    </w:p>
+    <w:p>
+      <w:pPr>
+        <w:pStyle w:val="ListParagraph"/>
+        <w:numPr>
+          <w:ilvl w:val="6"/>
+          <w:numId w:val="15"/>
+        </w:numPr>
+      </w:pPr>
+      <w:r>
+        <w:t>Refine operation procedures frequently</w:t>
+      </w:r>
+    </w:p>
+    <w:p>
+      <w:pPr>
+        <w:pStyle w:val="ListParagraph"/>
+        <w:numPr>
+          <w:ilvl w:val="6"/>
+          <w:numId w:val="15"/>
+        </w:numPr>
+      </w:pPr>
+      <w:r>
+        <w:t>Anticipate failure</w:t>
+      </w:r>
+    </w:p>
+    <w:p>
+      <w:pPr>
+        <w:pStyle w:val="ListParagraph"/>
+        <w:numPr>
+          <w:ilvl w:val="6"/>
+          <w:numId w:val="15"/>
+        </w:numPr>
+      </w:pPr>
+      <w:r>
+        <w:t>Learn from all operational failure</w:t>
+      </w:r>
+    </w:p>
+    <w:p>
+      <w:pPr>
+        <w:pStyle w:val="ListParagraph"/>
+        <w:numPr>
+          <w:ilvl w:val="1"/>
+          <w:numId w:val="1"/>
+        </w:numPr>
+        <w:rPr>
+          <w:b/>
+        </w:rPr>
+      </w:pPr>
+      <w:r>
+        <w:rPr>
+          <w:b/>
+        </w:rPr>
+        <w:t>Security</w:t>
+      </w:r>
+      <w:r>
+        <w:rPr>
+          <w:b/>
+        </w:rPr>
+        <w:t xml:space="preserve">: </w:t>
+      </w:r>
+      <w:r>
+        <w:t>The security pillar describes how to take advantage of cloud technologies to protect data, systems, and assets in a way that can improve your security posture.</w:t>
+      </w:r>
+    </w:p>
+    <w:p>
+      <w:pPr>
+        <w:pStyle w:val="ListParagraph"/>
+        <w:numPr>
+          <w:ilvl w:val="3"/>
+          <w:numId w:val="14"/>
+        </w:numPr>
+        <w:rPr>
+          <w:b/>
+        </w:rPr>
+      </w:pPr>
+      <w:r>
+        <w:rPr>
+          <w:b/>
+        </w:rPr>
+        <w:t xml:space="preserve">  </w:t>
+      </w:r>
+      <w:r>
+        <w:rPr>
+          <w:b/>
+        </w:rPr>
+        <w:t xml:space="preserve">Design Principles: </w:t>
+      </w:r>
+    </w:p>
+    <w:p>
+      <w:pPr>
+        <w:pStyle w:val="ListParagraph"/>
+        <w:numPr>
+          <w:ilvl w:val="6"/>
+          <w:numId w:val="15"/>
+        </w:numPr>
+      </w:pPr>
+      <w:r>
+        <w:t>Implement a strong identity foundation</w:t>
+      </w:r>
+    </w:p>
+    <w:p>
+      <w:pPr>
+        <w:pStyle w:val="ListParagraph"/>
+        <w:numPr>
+          <w:ilvl w:val="6"/>
+          <w:numId w:val="15"/>
+        </w:numPr>
+      </w:pPr>
+      <w:r>
+        <w:t>Enable traceability</w:t>
+      </w:r>
+    </w:p>
+    <w:p>
+      <w:pPr>
+        <w:pStyle w:val="ListParagraph"/>
+        <w:numPr>
+          <w:ilvl w:val="6"/>
+          <w:numId w:val="15"/>
+        </w:numPr>
+      </w:pPr>
+      <w:r>
+        <w:t>Apply security at all layers</w:t>
+      </w:r>
+    </w:p>
+    <w:p>
+      <w:pPr>
+        <w:pStyle w:val="ListParagraph"/>
+        <w:numPr>
+          <w:ilvl w:val="6"/>
+          <w:numId w:val="15"/>
+        </w:numPr>
+      </w:pPr>
+      <w:r>
+        <w:t>Automate security best practices.</w:t>
+      </w:r>
+    </w:p>
+    <w:p>
+      <w:pPr>
+        <w:pStyle w:val="ListParagraph"/>
+        <w:numPr>
+          <w:ilvl w:val="6"/>
+          <w:numId w:val="15"/>
+        </w:numPr>
+      </w:pPr>
+      <w:r>
+        <w:t>Protect data in transit and a rest.</w:t>
+      </w:r>
+    </w:p>
+    <w:p>
+      <w:pPr>
+        <w:pStyle w:val="ListParagraph"/>
+        <w:numPr>
+          <w:ilvl w:val="6"/>
+          <w:numId w:val="15"/>
+        </w:numPr>
+      </w:pPr>
+      <w:r>
+        <w:t>Keep people away from data.</w:t>
+      </w:r>
+    </w:p>
+    <w:p>
+      <w:pPr>
+        <w:pStyle w:val="ListParagraph"/>
+        <w:numPr>
+          <w:ilvl w:val="6"/>
+          <w:numId w:val="15"/>
+        </w:numPr>
+      </w:pPr>
+      <w:r>
+        <w:t>Prepare for security events.</w:t>
+      </w:r>
+    </w:p>
+    <w:p>
+      <w:pPr>
+        <w:pStyle w:val="ListParagraph"/>
+        <w:numPr>
+          <w:ilvl w:val="1"/>
+          <w:numId w:val="1"/>
+        </w:numPr>
+        <w:rPr>
+          <w:b/>
+        </w:rPr>
+      </w:pPr>
+      <w:r>
+        <w:rPr>
+          <w:b/>
+        </w:rPr>
+        <w:t xml:space="preserve">Reliability: </w:t>
+      </w:r>
+      <w:r>
+        <w:t>The reliability pillar encompassed the ability of a workload to perform its intended function correctly and consistently when it’s expected to. This includes the ability to operate and test he workload through its total lifecycle.</w:t>
+      </w:r>
+    </w:p>
+    <w:p>
+      <w:pPr>
+        <w:pStyle w:val="ListParagraph"/>
+        <w:numPr>
+          <w:ilvl w:val="3"/>
+          <w:numId w:val="14"/>
+        </w:numPr>
+        <w:rPr>
+          <w:b/>
+        </w:rPr>
+      </w:pPr>
+      <w:r>
+        <w:rPr>
+          <w:b/>
+        </w:rPr>
+        <w:t xml:space="preserve">  </w:t>
+      </w:r>
+      <w:r>
+        <w:rPr>
+          <w:b/>
+        </w:rPr>
+        <w:t xml:space="preserve">Design Principles: </w:t>
+      </w:r>
+    </w:p>
+    <w:p>
+      <w:pPr>
+        <w:pStyle w:val="ListParagraph"/>
+        <w:numPr>
+          <w:ilvl w:val="6"/>
+          <w:numId w:val="15"/>
+        </w:numPr>
+        <w:rPr>
+          <w:b/>
+        </w:rPr>
+      </w:pPr>
+      <w:r>
+        <w:t>Automatically recover from failure.</w:t>
+      </w:r>
+    </w:p>
+    <w:p>
+      <w:pPr>
+        <w:pStyle w:val="ListParagraph"/>
+        <w:numPr>
+          <w:ilvl w:val="6"/>
+          <w:numId w:val="15"/>
+        </w:numPr>
+        <w:rPr>
+          <w:b/>
+        </w:rPr>
+      </w:pPr>
+      <w:r>
+        <w:t>Test recovery procedures.</w:t>
+      </w:r>
+    </w:p>
+    <w:p>
+      <w:pPr>
+        <w:pStyle w:val="ListParagraph"/>
+        <w:numPr>
+          <w:ilvl w:val="6"/>
+          <w:numId w:val="15"/>
+        </w:numPr>
+        <w:rPr>
+          <w:b/>
+        </w:rPr>
+      </w:pPr>
+      <w:r>
+        <w:t>Scale horizontally to increase aggregate workload availability.</w:t>
+      </w:r>
+    </w:p>
+    <w:p>
+      <w:pPr>
+        <w:pStyle w:val="ListParagraph"/>
+        <w:numPr>
+          <w:ilvl w:val="6"/>
+          <w:numId w:val="15"/>
+        </w:numPr>
+        <w:rPr>
+          <w:b/>
+        </w:rPr>
+      </w:pPr>
+      <w:r>
+        <w:t>Stop guessing capacity</w:t>
+      </w:r>
+    </w:p>
+    <w:p>
+      <w:pPr>
+        <w:pStyle w:val="ListParagraph"/>
+        <w:numPr>
+          <w:ilvl w:val="6"/>
+          <w:numId w:val="15"/>
+        </w:numPr>
+        <w:rPr>
+          <w:b/>
+        </w:rPr>
+      </w:pPr>
+      <w:r>
+        <w:t>Manage change in automation.</w:t>
+      </w:r>
+    </w:p>
+    <w:p>
+      <w:pPr>
+        <w:pStyle w:val="ListParagraph"/>
+        <w:numPr>
+          <w:ilvl w:val="1"/>
+          <w:numId w:val="1"/>
+        </w:numPr>
+        <w:rPr>
+          <w:b/>
+        </w:rPr>
+      </w:pPr>
+      <w:r>
+        <w:rPr>
+          <w:b/>
+        </w:rPr>
+        <w:t>Performance Efficiency</w:t>
+      </w:r>
+      <w:r>
+        <w:rPr>
+          <w:b/>
+        </w:rPr>
+        <w:t>:</w:t>
+      </w:r>
+      <w:r>
+        <w:rPr>
+          <w:b/>
+        </w:rPr>
+        <w:t xml:space="preserve"> </w:t>
+      </w:r>
+      <w:r>
+        <w:t xml:space="preserve">The performance efficiency pillar focuses on structured and streamlined allocation of IT and computing resources. Key topics </w:t>
+      </w:r>
+      <w:r>
+        <w:t>include selecting resource types and sizes optimized for workload requirements, monitoring performance, and maintaining efficiency as business needs evolve.</w:t>
+      </w:r>
+    </w:p>
+    <w:p>
+      <w:pPr>
+        <w:pStyle w:val="ListParagraph"/>
+        <w:numPr>
+          <w:ilvl w:val="3"/>
+          <w:numId w:val="14"/>
+        </w:numPr>
+        <w:rPr>
+          <w:b/>
+        </w:rPr>
+      </w:pPr>
+      <w:r>
+        <w:rPr>
+          <w:b/>
+        </w:rPr>
+        <w:t xml:space="preserve">  </w:t>
+      </w:r>
+      <w:r>
+        <w:rPr>
+          <w:b/>
+        </w:rPr>
+        <w:t xml:space="preserve">Design Principles: </w:t>
+      </w:r>
+    </w:p>
+    <w:p>
+      <w:pPr>
+        <w:pStyle w:val="ListParagraph"/>
+        <w:numPr>
+          <w:ilvl w:val="6"/>
+          <w:numId w:val="15"/>
+        </w:numPr>
+        <w:rPr>
+          <w:b/>
+        </w:rPr>
+      </w:pPr>
+      <w:r>
+        <w:t>Democratize advanced technologies.</w:t>
+      </w:r>
+    </w:p>
+    <w:p>
+      <w:pPr>
+        <w:pStyle w:val="ListParagraph"/>
+        <w:numPr>
+          <w:ilvl w:val="6"/>
+          <w:numId w:val="15"/>
+        </w:numPr>
+        <w:rPr>
+          <w:b/>
+        </w:rPr>
+      </w:pPr>
+      <w:r>
+        <w:t xml:space="preserve">Go global </w:t>
+      </w:r>
+      <w:r>
+        <w:t>in minutes</w:t>
+      </w:r>
+    </w:p>
+    <w:p>
+      <w:pPr>
+        <w:pStyle w:val="ListParagraph"/>
+        <w:numPr>
+          <w:ilvl w:val="6"/>
+          <w:numId w:val="15"/>
+        </w:numPr>
+        <w:rPr>
+          <w:b/>
+        </w:rPr>
+      </w:pPr>
+      <w:r>
+        <w:lastRenderedPageBreak/>
+        <w:t>Use server less architectures.</w:t>
+      </w:r>
+    </w:p>
+    <w:p>
+      <w:pPr>
+        <w:pStyle w:val="ListParagraph"/>
+        <w:numPr>
+          <w:ilvl w:val="6"/>
+          <w:numId w:val="15"/>
+        </w:numPr>
+        <w:rPr>
+          <w:b/>
+        </w:rPr>
+      </w:pPr>
+      <w:r>
+        <w:t>Experiment more often</w:t>
+      </w:r>
+    </w:p>
+    <w:p>
+      <w:pPr>
+        <w:pStyle w:val="ListParagraph"/>
+        <w:numPr>
+          <w:ilvl w:val="6"/>
+          <w:numId w:val="15"/>
+        </w:numPr>
+        <w:rPr>
+          <w:b/>
+        </w:rPr>
+      </w:pPr>
+      <w:r>
+        <w:t xml:space="preserve">Consider mechanical sympathy </w:t>
+      </w:r>
+    </w:p>
+    <w:p>
+      <w:pPr>
+        <w:pStyle w:val="ListParagraph"/>
+        <w:numPr>
+          <w:ilvl w:val="1"/>
+          <w:numId w:val="1"/>
+        </w:numPr>
+        <w:rPr>
+          <w:b/>
+        </w:rPr>
+      </w:pPr>
+      <w:r>
+        <w:rPr>
+          <w:b/>
+        </w:rPr>
+        <w:t>Cost Optimization</w:t>
+      </w:r>
+      <w:r>
+        <w:rPr>
+          <w:b/>
+        </w:rPr>
+        <w:t xml:space="preserve">: </w:t>
+      </w:r>
+      <w:r>
+        <w:t>The cost optimization pillar focuses on avoiding unnecessary costs. Key topics include understanding spending over time and controlling fund allocation, selecting resources of the right type and quantity and scaling to meet business needs without overspending.</w:t>
+      </w:r>
+    </w:p>
+    <w:p>
+      <w:pPr>
+        <w:pStyle w:val="ListParagraph"/>
+      </w:pPr>
+      <w:r>
+        <w:t>The cost optimization pillar includes the ability to run systems to deliver business value at the lowest price point.</w:t>
+      </w:r>
+    </w:p>
+    <w:p>
+      <w:pPr>
+        <w:pStyle w:val="ListParagraph"/>
+        <w:numPr>
+          <w:ilvl w:val="3"/>
+          <w:numId w:val="14"/>
+        </w:numPr>
+        <w:rPr>
+          <w:b/>
+        </w:rPr>
+      </w:pPr>
+      <w:r>
+        <w:rPr>
+          <w:b/>
+        </w:rPr>
+        <w:t xml:space="preserve">  </w:t>
+      </w:r>
+      <w:r>
+        <w:rPr>
+          <w:b/>
+        </w:rPr>
+        <w:t xml:space="preserve">Design Principles: </w:t>
+      </w:r>
+    </w:p>
+    <w:p>
+      <w:pPr>
+        <w:pStyle w:val="ListParagraph"/>
+        <w:numPr>
+          <w:ilvl w:val="6"/>
+          <w:numId w:val="15"/>
+        </w:numPr>
+        <w:rPr>
+          <w:b/>
+        </w:rPr>
+      </w:pPr>
+      <w:r>
+        <w:t>Implement cloud financial management.</w:t>
+      </w:r>
+    </w:p>
+    <w:p>
+      <w:pPr>
+        <w:pStyle w:val="ListParagraph"/>
+        <w:numPr>
+          <w:ilvl w:val="6"/>
+          <w:numId w:val="15"/>
+        </w:numPr>
+        <w:rPr>
+          <w:b/>
+        </w:rPr>
+      </w:pPr>
+      <w:r>
+        <w:t>Adopt a consumption model.</w:t>
+      </w:r>
+    </w:p>
+    <w:p>
+      <w:pPr>
+        <w:pStyle w:val="ListParagraph"/>
+        <w:numPr>
+          <w:ilvl w:val="6"/>
+          <w:numId w:val="15"/>
+        </w:numPr>
+        <w:rPr>
+          <w:b/>
+        </w:rPr>
+      </w:pPr>
+      <w:r>
+        <w:t>Measure overall efficiency.</w:t>
+      </w:r>
+    </w:p>
+    <w:p>
+      <w:pPr>
+        <w:pStyle w:val="ListParagraph"/>
+        <w:numPr>
+          <w:ilvl w:val="6"/>
+          <w:numId w:val="15"/>
+        </w:numPr>
+        <w:rPr>
+          <w:b/>
+        </w:rPr>
+      </w:pPr>
+      <w:r>
+        <w:t xml:space="preserve">Stop spending money </w:t>
+      </w:r>
+      <w:r>
+        <w:t>on undifferentiated heavy lifting.</w:t>
+      </w:r>
+    </w:p>
+    <w:p>
+      <w:pPr>
+        <w:pStyle w:val="ListParagraph"/>
+        <w:numPr>
+          <w:ilvl w:val="6"/>
+          <w:numId w:val="15"/>
+        </w:numPr>
+        <w:rPr>
+          <w:b/>
+        </w:rPr>
+      </w:pPr>
+      <w:r>
+        <w:t>Analyze and attribute expenditure.</w:t>
+      </w:r>
+    </w:p>
+    <w:p>
+      <w:pPr>
+        <w:pStyle w:val="ListParagraph"/>
+        <w:rPr>
+          <w:b/>
+        </w:rPr>
+      </w:pPr>
+    </w:p>
+    <w:p>
+      <w:pPr>
+        <w:pStyle w:val="ListParagraph"/>
+        <w:numPr>
+          <w:ilvl w:val="1"/>
+          <w:numId w:val="1"/>
+        </w:numPr>
+        <w:rPr>
+          <w:b/>
+        </w:rPr>
+      </w:pPr>
+      <w:r>
+        <w:rPr>
+          <w:b/>
+        </w:rPr>
+        <w:t>Sustainability</w:t>
+      </w:r>
+      <w:r>
+        <w:rPr>
+          <w:b/>
+        </w:rPr>
+        <w:t>:</w:t>
+      </w:r>
+      <w:r>
+        <w:rPr>
+          <w:b/>
+        </w:rPr>
+        <w:t xml:space="preserve"> </w:t>
+      </w:r>
+      <w:r>
+        <w:t>The sustainability pillar focuses on minimizing the environmental impacts of running cloud workloads. Key topics include a shared responsibility model for sustainability, understanding impact, and maximizing utilization to minimize required resources and reduce downstream impacts.</w:t>
+      </w:r>
+    </w:p>
+    <w:p>
+      <w:pPr>
+        <w:pStyle w:val="ListParagraph"/>
+        <w:rPr>
+          <w:b/>
+        </w:rPr>
+      </w:pPr>
+      <w:bookmarkStart w:id="0" w:name="_GoBack"/>
+      <w:bookmarkEnd w:id="0"/>
+    </w:p>
+    <w:p>
+      <w:pPr>
+        <w:pStyle w:val="ListParagraph"/>
+        <w:rPr>
+          <w:b/>
+        </w:rPr>
+      </w:pPr>
+      <w:r>
+        <w:t xml:space="preserve">The discipline of sustainability </w:t>
+      </w:r>
+      <w:r>
+        <w:t>addresses</w:t>
+      </w:r>
+      <w:r>
+        <w:t xml:space="preserve"> the long-term environmental, economic, and </w:t>
+      </w:r>
+      <w:r>
+        <w:t>societal impact of your business activities.</w:t>
+      </w:r>
+    </w:p>
+    <w:p>
+      <w:pPr>
+        <w:pStyle w:val="ListParagraph"/>
+        <w:numPr>
+          <w:ilvl w:val="3"/>
+          <w:numId w:val="14"/>
+        </w:numPr>
+        <w:rPr>
+          <w:b/>
+        </w:rPr>
+      </w:pPr>
+      <w:r>
+        <w:rPr>
+          <w:b/>
+        </w:rPr>
+        <w:t xml:space="preserve">  </w:t>
+      </w:r>
+      <w:r>
+        <w:rPr>
+          <w:b/>
+        </w:rPr>
+        <w:t xml:space="preserve">Design Principles: </w:t>
+      </w:r>
+    </w:p>
+    <w:p>
+      <w:pPr>
+        <w:pStyle w:val="ListParagraph"/>
+        <w:numPr>
+          <w:ilvl w:val="6"/>
+          <w:numId w:val="15"/>
+        </w:numPr>
+        <w:rPr>
+          <w:b/>
+        </w:rPr>
+      </w:pPr>
+      <w:r>
+        <w:t>Understand your impact</w:t>
+      </w:r>
+    </w:p>
+    <w:p>
+      <w:pPr>
+        <w:pStyle w:val="ListParagraph"/>
+        <w:numPr>
+          <w:ilvl w:val="6"/>
+          <w:numId w:val="15"/>
+        </w:numPr>
+        <w:rPr>
+          <w:b/>
+        </w:rPr>
+      </w:pPr>
+      <w:r>
+        <w:t xml:space="preserve">Establish </w:t>
+      </w:r>
+      <w:r>
+        <w:t>sustainability goals.</w:t>
+      </w:r>
+    </w:p>
+    <w:p>
+      <w:pPr>
+        <w:pStyle w:val="ListParagraph"/>
+        <w:numPr>
+          <w:ilvl w:val="6"/>
+          <w:numId w:val="15"/>
+        </w:numPr>
+        <w:rPr>
+          <w:b/>
+        </w:rPr>
+      </w:pPr>
+      <w:r>
+        <w:t xml:space="preserve">Maximize utilization </w:t>
+      </w:r>
+    </w:p>
+    <w:p>
+      <w:pPr>
+        <w:pStyle w:val="ListParagraph"/>
+        <w:numPr>
+          <w:ilvl w:val="6"/>
+          <w:numId w:val="15"/>
+        </w:numPr>
+        <w:rPr>
+          <w:b/>
+        </w:rPr>
+      </w:pPr>
+      <w:r>
+        <w:t>Use managed services.</w:t>
+      </w:r>
+    </w:p>
+    <w:p>
+      <w:pPr>
+        <w:pStyle w:val="ListParagraph"/>
+        <w:numPr>
+          <w:ilvl w:val="6"/>
+          <w:numId w:val="15"/>
+        </w:numPr>
+        <w:rPr>
+          <w:b/>
+        </w:rPr>
+      </w:pPr>
+      <w:r>
+        <w:t>Reduce the downstream impact of your cloud workload.</w:t>
       </w:r>
     </w:p>
     <w:p>
       <w:pPr>
         <w:pStyle w:val="ListParagraph"/>
         <w:ind w:left="360"/>
-      </w:pPr>
-      <w:r>
-        <w:t xml:space="preserve"> .Suppose we have one </w:t>
-      </w:r>
-      <w:proofErr w:type="spellStart"/>
-      <w:r>
-        <w:t>Monolothic</w:t>
-      </w:r>
-      <w:proofErr w:type="spellEnd"/>
-      <w:r>
-        <w:t xml:space="preserve"> service for account and we decided to get all account info to migrate from monolithic to micro-services  then we create account-service and keep all account related API in this service who is calling this service they can still use same API but </w:t>
-      </w:r>
-      <w:r>
-        <w:rPr>
-          <w:b/>
-        </w:rPr>
-        <w:t xml:space="preserve">at API Gateway label we will move some traffic from </w:t>
-      </w:r>
-      <w:proofErr w:type="spellStart"/>
-      <w:r>
-        <w:rPr>
-          <w:b/>
-        </w:rPr>
-        <w:t>monolotic</w:t>
-      </w:r>
-      <w:proofErr w:type="spellEnd"/>
-      <w:r>
-        <w:rPr>
-          <w:b/>
-        </w:rPr>
-        <w:t xml:space="preserve"> to </w:t>
-      </w:r>
-      <w:proofErr w:type="spellStart"/>
-      <w:r>
-        <w:rPr>
-          <w:b/>
-        </w:rPr>
-        <w:t>microservice</w:t>
-      </w:r>
-      <w:proofErr w:type="spellEnd"/>
-      <w:r>
-        <w:t xml:space="preserve">, once we will make sure there is no any issue in newly created </w:t>
-      </w:r>
-      <w:proofErr w:type="spellStart"/>
-      <w:r>
-        <w:t>microserives</w:t>
-      </w:r>
-      <w:proofErr w:type="spellEnd"/>
-      <w:r>
-        <w:t xml:space="preserve"> then we move slowly </w:t>
-      </w:r>
-      <w:proofErr w:type="spellStart"/>
-      <w:r>
-        <w:t>slowly</w:t>
-      </w:r>
-      <w:proofErr w:type="spellEnd"/>
-      <w:r>
-        <w:t xml:space="preserve"> to new micro </w:t>
-      </w:r>
-      <w:proofErr w:type="spellStart"/>
-      <w:r>
-        <w:t>servies</w:t>
-      </w:r>
-      <w:proofErr w:type="spellEnd"/>
-      <w:r>
-        <w:t>, this process is called strangler.</w:t>
-      </w:r>
-    </w:p>
-    <w:p>
-      <w:pPr>
-        <w:pStyle w:val="ListParagraph"/>
-        <w:ind w:left="360"/>
-      </w:pPr>
-    </w:p>
-    <w:p>
-      <w:pPr>
-        <w:pStyle w:val="ListParagraph"/>
-        <w:ind w:left="360"/>
-        <w:rPr>
-          <w:b/>
-        </w:rPr>
-      </w:pPr>
-      <w:r>
-        <w:rPr>
-          <w:b/>
-        </w:rPr>
-        <w:t>Diverting traffic from monolithic to micro services is called straggler pattern.</w:t>
-      </w:r>
-    </w:p>
-    <w:p>
-      <w:pPr>
-        <w:pStyle w:val="ListParagraph"/>
-        <w:ind w:left="360"/>
+        <w:rPr>
+          <w:b/>
+        </w:rPr>
       </w:pPr>
     </w:p>
     <w:p>
@@ -149,6 +927,145 @@
           <w:ilvl w:val="0"/>
           <w:numId w:val="1"/>
         </w:numPr>
+      </w:pPr>
+      <w:r>
+        <w:rPr>
+          <w:b/>
+        </w:rPr>
+        <w:t>Strangler Patter</w:t>
+      </w:r>
+      <w:r>
+        <w:rPr>
+          <w:b/>
+        </w:rPr>
+        <w:t>n</w:t>
+      </w:r>
+      <w:r>
+        <w:t xml:space="preserve">: Strangler pattern is nothing but just to strange from </w:t>
+      </w:r>
+      <w:proofErr w:type="spellStart"/>
+      <w:r>
+        <w:t>Monolothic</w:t>
+      </w:r>
+      <w:proofErr w:type="spellEnd"/>
+      <w:r>
+        <w:t xml:space="preserve"> to </w:t>
+      </w:r>
+      <w:proofErr w:type="spellStart"/>
+      <w:r>
+        <w:t>microservices</w:t>
+      </w:r>
+      <w:proofErr w:type="spellEnd"/>
+      <w:r>
+        <w:t>.</w:t>
+      </w:r>
+    </w:p>
+    <w:p>
+      <w:pPr>
+        <w:pStyle w:val="ListParagraph"/>
+        <w:ind w:left="360"/>
+      </w:pPr>
+      <w:r>
+        <w:t xml:space="preserve"> .Suppose we have one </w:t>
+      </w:r>
+      <w:proofErr w:type="spellStart"/>
+      <w:r>
+        <w:t>Monolothic</w:t>
+      </w:r>
+      <w:proofErr w:type="spellEnd"/>
+      <w:r>
+        <w:t xml:space="preserve"> service for account and we decided to get all account info to migrate from monolithic to micro-services  then we create account-service and keep all account related API in this service who is calling this service they can still use same API but </w:t>
+      </w:r>
+      <w:r>
+        <w:rPr>
+          <w:b/>
+        </w:rPr>
+        <w:t xml:space="preserve">at API Gateway label we will move some traffic from </w:t>
+      </w:r>
+      <w:proofErr w:type="spellStart"/>
+      <w:r>
+        <w:rPr>
+          <w:b/>
+        </w:rPr>
+        <w:t>monolotic</w:t>
+      </w:r>
+      <w:proofErr w:type="spellEnd"/>
+      <w:r>
+        <w:rPr>
+          <w:b/>
+        </w:rPr>
+        <w:t xml:space="preserve"> to </w:t>
+      </w:r>
+      <w:proofErr w:type="spellStart"/>
+      <w:r>
+        <w:rPr>
+          <w:b/>
+        </w:rPr>
+        <w:t>microservice</w:t>
+      </w:r>
+      <w:proofErr w:type="spellEnd"/>
+      <w:r>
+        <w:t xml:space="preserve">, once we will make sure there is no any issue in newly created </w:t>
+      </w:r>
+      <w:proofErr w:type="spellStart"/>
+      <w:r>
+        <w:t>microserives</w:t>
+      </w:r>
+      <w:proofErr w:type="spellEnd"/>
+      <w:r>
+        <w:t xml:space="preserve"> then we move slowly </w:t>
+      </w:r>
+      <w:proofErr w:type="spellStart"/>
+      <w:r>
+        <w:t>slowly</w:t>
+      </w:r>
+      <w:proofErr w:type="spellEnd"/>
+      <w:r>
+        <w:t xml:space="preserve"> to new micro </w:t>
+      </w:r>
+      <w:proofErr w:type="spellStart"/>
+      <w:r>
+        <w:t>servies</w:t>
+      </w:r>
+      <w:proofErr w:type="spellEnd"/>
+      <w:r>
+        <w:t>, this process is called strangler.</w:t>
+      </w:r>
+    </w:p>
+    <w:p>
+      <w:pPr>
+        <w:pStyle w:val="ListParagraph"/>
+        <w:ind w:left="360"/>
+      </w:pPr>
+    </w:p>
+    <w:p>
+      <w:pPr>
+        <w:pStyle w:val="ListParagraph"/>
+        <w:ind w:left="360"/>
+        <w:rPr>
+          <w:b/>
+        </w:rPr>
+      </w:pPr>
+      <w:r>
+        <w:rPr>
+          <w:b/>
+        </w:rPr>
+        <w:t>Diverting traffic from monolithic to micro services is called straggler pattern.</w:t>
+      </w:r>
+    </w:p>
+    <w:p>
+      <w:pPr>
+        <w:pStyle w:val="ListParagraph"/>
+        <w:ind w:left="360"/>
+      </w:pPr>
+    </w:p>
+    <w:p>
+      <w:pPr>
+        <w:pStyle w:val="ListParagraph"/>
+        <w:numPr>
+          <w:ilvl w:val="0"/>
+          <w:numId w:val="1"/>
+        </w:numPr>
         <w:rPr>
           <w:b/>
         </w:rPr>
@@ -205,6 +1122,7 @@
         <w:rPr>
           <w:b/>
         </w:rPr>
+        <w:lastRenderedPageBreak/>
         <w:t>ACID Property</w:t>
       </w:r>
       <w:r>
@@ -226,7 +1144,15 @@
         <w:t xml:space="preserve">     </w:t>
       </w:r>
       <w:r>
-        <w:t xml:space="preserve">ACID property easily can be achieved, it can be achieved by </w:t>
+        <w:t xml:space="preserve">ACID property easily can be </w:t>
+      </w:r>
+      <w:proofErr w:type="gramStart"/>
+      <w:r>
+        <w:t>achieved,</w:t>
+      </w:r>
+      <w:proofErr w:type="gramEnd"/>
+      <w:r>
+        <w:t xml:space="preserve"> it can be achieved by </w:t>
       </w:r>
       <w:r>
         <w:rPr>
@@ -319,7 +1245,15 @@
         <w:t>cannot</w:t>
       </w:r>
       <w:r>
-        <w:t xml:space="preserve"> scale based on service, We always fear to alter or delete and table or column</w:t>
+        <w:t xml:space="preserve"> scale based on service, </w:t>
+      </w:r>
+      <w:proofErr w:type="gramStart"/>
+      <w:r>
+        <w:t>We</w:t>
+      </w:r>
+      <w:proofErr w:type="gramEnd"/>
+      <w:r>
+        <w:t xml:space="preserve"> always fear to alter or delete and table or column</w:t>
       </w:r>
     </w:p>
     <w:p>
@@ -391,6 +1325,7 @@
           <w:b/>
         </w:rPr>
       </w:pPr>
+      <w:proofErr w:type="gramStart"/>
       <w:r>
         <w:rPr>
           <w:b/>
@@ -401,7 +1336,14 @@
         <w:rPr>
           <w:b/>
         </w:rPr>
-        <w:t xml:space="preserve">(Command Query Request Segregation) </w:t>
+        <w:t>(</w:t>
+      </w:r>
+      <w:proofErr w:type="gramEnd"/>
+      <w:r>
+        <w:rPr>
+          <w:b/>
+        </w:rPr>
+        <w:t xml:space="preserve">Command Query Request Segregation) </w:t>
       </w:r>
       <w:r>
         <w:rPr>
@@ -505,7 +1447,15 @@
         <w:ind w:left="360"/>
       </w:pPr>
       <w:r>
-        <w:t>Saga pattern by two way.</w:t>
+        <w:t xml:space="preserve">Saga pattern by two </w:t>
+      </w:r>
+      <w:proofErr w:type="gramStart"/>
+      <w:r>
+        <w:t>way</w:t>
+      </w:r>
+      <w:proofErr w:type="gramEnd"/>
+      <w:r>
+        <w:t>.</w:t>
       </w:r>
     </w:p>
     <w:p>
@@ -547,6 +1497,7 @@
         </w:rPr>
       </w:pPr>
       <w:proofErr w:type="spellStart"/>
+      <w:proofErr w:type="gramStart"/>
       <w:r>
         <w:rPr>
           <w:b/>
@@ -558,7 +1509,14 @@
         <w:rPr>
           <w:b/>
         </w:rPr>
-        <w:t xml:space="preserve"> : </w:t>
+        <w:t xml:space="preserve"> :</w:t>
+      </w:r>
+      <w:proofErr w:type="gramEnd"/>
+      <w:r>
+        <w:rPr>
+          <w:b/>
+        </w:rPr>
+        <w:t xml:space="preserve"> </w:t>
       </w:r>
       <w:r>
         <w:t>It can be achieved by API.</w:t>
@@ -603,10 +1561,18 @@
         </w:numPr>
       </w:pPr>
       <w:r>
-        <w:t xml:space="preserve">Single Server </w:t>
-      </w:r>
-      <w:r>
-        <w:t>:  We have App and DB on same server.</w:t>
+        <w:t xml:space="preserve">Single </w:t>
+      </w:r>
+      <w:proofErr w:type="gramStart"/>
+      <w:r>
+        <w:t xml:space="preserve">Server </w:t>
+      </w:r>
+      <w:r>
+        <w:t>:</w:t>
+      </w:r>
+      <w:proofErr w:type="gramEnd"/>
+      <w:r>
+        <w:t xml:space="preserve">  We have App and DB on same server.</w:t>
       </w:r>
     </w:p>
     <w:p>
@@ -636,7 +1602,6 @@
         </w:numPr>
       </w:pPr>
       <w:r>
-        <w:lastRenderedPageBreak/>
         <w:t>Load Balancer + Multiple App Server</w:t>
       </w:r>
       <w:r>
@@ -659,7 +1624,15 @@
         <w:pStyle w:val="ListParagraph"/>
       </w:pPr>
       <w:r>
-        <w:t xml:space="preserve">Load balancer talk on private IP, it mean Client </w:t>
+        <w:t xml:space="preserve">Load balancer talk on private IP, it </w:t>
+      </w:r>
+      <w:proofErr w:type="gramStart"/>
+      <w:r>
+        <w:t>mean</w:t>
+      </w:r>
+      <w:proofErr w:type="gramEnd"/>
+      <w:r>
+        <w:t xml:space="preserve"> Client </w:t>
       </w:r>
       <w:proofErr w:type="spellStart"/>
       <w:r>
@@ -710,12 +1683,17 @@
         <w:t xml:space="preserve">All query will come to slave </w:t>
       </w:r>
       <w:proofErr w:type="spellStart"/>
+      <w:proofErr w:type="gramStart"/>
       <w:r>
         <w:t>db</w:t>
       </w:r>
       <w:proofErr w:type="spellEnd"/>
       <w:r>
-        <w:t>, in failure case of master node we can create any slave node as maser node.</w:t>
+        <w:t>,</w:t>
+      </w:r>
+      <w:proofErr w:type="gramEnd"/>
+      <w:r>
+        <w:t xml:space="preserve"> in failure case of master node we can create any slave node as maser node.</w:t>
       </w:r>
     </w:p>
     <w:p>
@@ -747,7 +1725,15 @@
         <w:pStyle w:val="ListParagraph"/>
       </w:pPr>
       <w:r>
-        <w:t xml:space="preserve">When app server talk to DB then we can add cache </w:t>
+        <w:t xml:space="preserve">When app server </w:t>
+      </w:r>
+      <w:proofErr w:type="gramStart"/>
+      <w:r>
+        <w:t>talk</w:t>
+      </w:r>
+      <w:proofErr w:type="gramEnd"/>
+      <w:r>
+        <w:t xml:space="preserve"> to DB then we can add cache </w:t>
       </w:r>
     </w:p>
     <w:p>
@@ -825,6 +1811,7 @@
         <w:rPr>
           <w:b/>
         </w:rPr>
+        <w:lastRenderedPageBreak/>
         <w:t>Rate Limit</w:t>
       </w:r>
       <w:r>
@@ -873,12 +1860,17 @@
         <w:t xml:space="preserve"> will require </w:t>
       </w:r>
       <w:proofErr w:type="spellStart"/>
+      <w:proofErr w:type="gramStart"/>
       <w:r>
         <w:t>Redish</w:t>
       </w:r>
       <w:proofErr w:type="spellEnd"/>
       <w:r>
-        <w:t>(for counter)</w:t>
+        <w:t>(</w:t>
+      </w:r>
+      <w:proofErr w:type="gramEnd"/>
+      <w:r>
+        <w:t>for counter)</w:t>
       </w:r>
       <w:r>
         <w:t xml:space="preserve"> and </w:t>
@@ -917,9 +1909,11 @@
       <w:r>
         <w:t xml:space="preserve">There are 5 </w:t>
       </w:r>
+      <w:proofErr w:type="gramStart"/>
       <w:r>
         <w:t>algorithm</w:t>
       </w:r>
+      <w:proofErr w:type="gramEnd"/>
       <w:r>
         <w:t>.</w:t>
       </w:r>
@@ -1051,7 +2045,15 @@
         <w:t>request</w:t>
       </w:r>
       <w:r>
-        <w:t xml:space="preserve"> because in 2 minute time frame 6 </w:t>
+        <w:t xml:space="preserve"> because in </w:t>
+      </w:r>
+      <w:proofErr w:type="gramStart"/>
+      <w:r>
+        <w:t>2 minute</w:t>
+      </w:r>
+      <w:proofErr w:type="gramEnd"/>
+      <w:r>
+        <w:t xml:space="preserve"> time frame 6 </w:t>
       </w:r>
       <w:r>
         <w:t>request</w:t>
@@ -1230,11 +2232,16 @@
           <w:numId w:val="7"/>
         </w:numPr>
       </w:pPr>
+      <w:proofErr w:type="gramStart"/>
       <w:r>
         <w:t>Broker</w:t>
       </w:r>
       <w:r>
-        <w:t>(Kafka Server)</w:t>
+        <w:t>(</w:t>
+      </w:r>
+      <w:proofErr w:type="gramEnd"/>
+      <w:r>
+        <w:t>Kafka Server)</w:t>
       </w:r>
     </w:p>
     <w:p>
@@ -1258,7 +2265,6 @@
         </w:numPr>
       </w:pPr>
       <w:r>
-        <w:lastRenderedPageBreak/>
         <w:t>Zookeeper</w:t>
       </w:r>
     </w:p>
@@ -1375,7 +2381,15 @@
         </w:numPr>
       </w:pPr>
       <w:r>
-        <w:t xml:space="preserve">It also help to </w:t>
+        <w:t xml:space="preserve">It also </w:t>
+      </w:r>
+      <w:proofErr w:type="gramStart"/>
+      <w:r>
+        <w:t>help</w:t>
+      </w:r>
+      <w:proofErr w:type="gramEnd"/>
+      <w:r>
+        <w:t xml:space="preserve"> to </w:t>
       </w:r>
       <w:r>
         <w:t>achieves</w:t>
@@ -1440,6 +2454,7 @@
         <w:t xml:space="preserve">Server side Application caching (like </w:t>
       </w:r>
       <w:proofErr w:type="spellStart"/>
+      <w:proofErr w:type="gramStart"/>
       <w:r>
         <w:t>Redis</w:t>
       </w:r>
@@ -1447,6 +2462,7 @@
       <w:r>
         <w:t xml:space="preserve"> )</w:t>
       </w:r>
+      <w:proofErr w:type="gramEnd"/>
     </w:p>
     <w:p>
       <w:pPr>
@@ -1473,6 +2489,7 @@
         </w:rPr>
       </w:pPr>
       <w:r>
+        <w:lastRenderedPageBreak/>
         <w:t>What is Distributed Caching and how it’s done.</w:t>
       </w:r>
     </w:p>
@@ -2848,13 +3865,7 @@
                         <w:jc w:val="center"/>
                       </w:pPr>
                       <w:r>
-                        <w:t>Cache</w:t>
-                      </w:r>
-                      <w:r>
-                        <w:t xml:space="preserve"> </w:t>
-                      </w:r>
-                      <w:r>
-                        <w:t>Client</w:t>
+                        <w:t>Cache Client</w:t>
                       </w:r>
                     </w:p>
                   </w:txbxContent>
@@ -3123,7 +4134,6 @@
         <w:rPr>
           <w:noProof/>
         </w:rPr>
-        <w:lastRenderedPageBreak/>
         <mc:AlternateContent>
           <mc:Choice Requires="wps">
             <w:drawing>
@@ -3945,7 +4955,15 @@
         <w:pStyle w:val="ListParagraph"/>
       </w:pPr>
       <w:r>
-        <w:t xml:space="preserve">It use hashing technique to store and read date in different cache server like chache1,cache2 in clock wise format. </w:t>
+        <w:t>It use hashing technique to store and read date in different cache server like chache</w:t>
+      </w:r>
+      <w:proofErr w:type="gramStart"/>
+      <w:r>
+        <w:t>1,cache</w:t>
+      </w:r>
+      <w:proofErr w:type="gramEnd"/>
+      <w:r>
+        <w:t xml:space="preserve">2 in clock wise format. </w:t>
       </w:r>
     </w:p>
     <w:p>
@@ -4031,6 +5049,7 @@
         </w:numPr>
       </w:pPr>
       <w:r>
+        <w:lastRenderedPageBreak/>
         <w:t>Even cache</w:t>
       </w:r>
       <w:r>
@@ -4039,9 +5058,11 @@
       <w:r>
         <w:t xml:space="preserve"> is </w:t>
       </w:r>
+      <w:proofErr w:type="gramStart"/>
       <w:r>
         <w:t>down,</w:t>
       </w:r>
+      <w:proofErr w:type="gramEnd"/>
       <w:r>
         <w:t xml:space="preserve"> request will not fail as it will fetch the data from DB.</w:t>
       </w:r>
@@ -4243,7 +5264,15 @@
         <w:t xml:space="preserve"> For new data read, there will </w:t>
       </w:r>
       <w:r>
-        <w:t>always be CACHE-MISS first(to resolve this, generally we can pre-heat the cache)</w:t>
+        <w:t xml:space="preserve">always be CACHE-MISS </w:t>
+      </w:r>
+      <w:proofErr w:type="gramStart"/>
+      <w:r>
+        <w:t>first(</w:t>
+      </w:r>
+      <w:proofErr w:type="gramEnd"/>
+      <w:r>
+        <w:t>to resolve this, generally we can pre-heat the cache)</w:t>
       </w:r>
     </w:p>
     <w:p>
@@ -4350,7 +5379,6 @@
         </w:numPr>
       </w:pPr>
       <w:r>
-        <w:lastRenderedPageBreak/>
         <w:t>Good approach for heavy read application.</w:t>
       </w:r>
     </w:p>
@@ -4387,7 +5415,15 @@
         </w:numPr>
       </w:pPr>
       <w:r>
-        <w:t xml:space="preserve">For new data read, there will always be CACHE-MISS first.(to resolve this, generally we </w:t>
+        <w:t xml:space="preserve">For new data read, there will always be CACHE-MISS </w:t>
+      </w:r>
+      <w:proofErr w:type="gramStart"/>
+      <w:r>
+        <w:t>first.(</w:t>
+      </w:r>
+      <w:proofErr w:type="gramEnd"/>
+      <w:r>
+        <w:t xml:space="preserve">to resolve this, generally we </w:t>
       </w:r>
       <w:proofErr w:type="spellStart"/>
       <w:r>
@@ -4541,6 +5577,7 @@
         </w:numPr>
       </w:pPr>
       <w:r>
+        <w:lastRenderedPageBreak/>
         <w:t>If DB is down write operation will fail.</w:t>
       </w:r>
     </w:p>
@@ -4916,8 +5953,6 @@
         </mc:AlternateContent>
       </w:r>
     </w:p>
-    <w:bookmarkStart w:id="0" w:name="_GoBack"/>
-    <w:bookmarkEnd w:id="0"/>
     <w:p>
       <w:r>
         <w:rPr>
@@ -5558,6 +6593,92 @@
     </w:lvl>
   </w:abstractNum>
   <w:abstractNum w:abstractNumId="1" w15:restartNumberingAfterBreak="0">
+    <w:nsid w:val="18622579"/>
+    <w:multiLevelType w:val="hybridMultilevel"/>
+    <w:tmpl w:val="81841DF2"/>
+    <w:lvl w:ilvl="0" w:tplc="0409000F">
+      <w:start w:val="1"/>
+      <w:numFmt w:val="decimal"/>
+      <w:lvlText w:val="%1."/>
+      <w:lvlJc w:val="left"/>
+      <w:pPr>
+        <w:ind w:left="1080" w:hanging="360"/>
+      </w:pPr>
+    </w:lvl>
+    <w:lvl w:ilvl="1" w:tplc="04090019" w:tentative="1">
+      <w:start w:val="1"/>
+      <w:numFmt w:val="lowerLetter"/>
+      <w:lvlText w:val="%2."/>
+      <w:lvlJc w:val="left"/>
+      <w:pPr>
+        <w:ind w:left="1800" w:hanging="360"/>
+      </w:pPr>
+    </w:lvl>
+    <w:lvl w:ilvl="2" w:tplc="0409001B" w:tentative="1">
+      <w:start w:val="1"/>
+      <w:numFmt w:val="lowerRoman"/>
+      <w:lvlText w:val="%3."/>
+      <w:lvlJc w:val="right"/>
+      <w:pPr>
+        <w:ind w:left="2520" w:hanging="180"/>
+      </w:pPr>
+    </w:lvl>
+    <w:lvl w:ilvl="3" w:tplc="0409000F" w:tentative="1">
+      <w:start w:val="1"/>
+      <w:numFmt w:val="decimal"/>
+      <w:lvlText w:val="%4."/>
+      <w:lvlJc w:val="left"/>
+      <w:pPr>
+        <w:ind w:left="3240" w:hanging="360"/>
+      </w:pPr>
+    </w:lvl>
+    <w:lvl w:ilvl="4" w:tplc="04090019" w:tentative="1">
+      <w:start w:val="1"/>
+      <w:numFmt w:val="lowerLetter"/>
+      <w:lvlText w:val="%5."/>
+      <w:lvlJc w:val="left"/>
+      <w:pPr>
+        <w:ind w:left="3960" w:hanging="360"/>
+      </w:pPr>
+    </w:lvl>
+    <w:lvl w:ilvl="5" w:tplc="0409001B" w:tentative="1">
+      <w:start w:val="1"/>
+      <w:numFmt w:val="lowerRoman"/>
+      <w:lvlText w:val="%6."/>
+      <w:lvlJc w:val="right"/>
+      <w:pPr>
+        <w:ind w:left="4680" w:hanging="180"/>
+      </w:pPr>
+    </w:lvl>
+    <w:lvl w:ilvl="6" w:tplc="0409000F" w:tentative="1">
+      <w:start w:val="1"/>
+      <w:numFmt w:val="decimal"/>
+      <w:lvlText w:val="%7."/>
+      <w:lvlJc w:val="left"/>
+      <w:pPr>
+        <w:ind w:left="5400" w:hanging="360"/>
+      </w:pPr>
+    </w:lvl>
+    <w:lvl w:ilvl="7" w:tplc="04090019" w:tentative="1">
+      <w:start w:val="1"/>
+      <w:numFmt w:val="lowerLetter"/>
+      <w:lvlText w:val="%8."/>
+      <w:lvlJc w:val="left"/>
+      <w:pPr>
+        <w:ind w:left="6120" w:hanging="360"/>
+      </w:pPr>
+    </w:lvl>
+    <w:lvl w:ilvl="8" w:tplc="0409001B" w:tentative="1">
+      <w:start w:val="1"/>
+      <w:numFmt w:val="lowerRoman"/>
+      <w:lvlText w:val="%9."/>
+      <w:lvlJc w:val="right"/>
+      <w:pPr>
+        <w:ind w:left="6840" w:hanging="180"/>
+      </w:pPr>
+    </w:lvl>
+  </w:abstractNum>
+  <w:abstractNum w:abstractNumId="2" w15:restartNumberingAfterBreak="0">
     <w:nsid w:val="1AE91BC5"/>
     <w:multiLevelType w:val="hybridMultilevel"/>
     <w:tmpl w:val="9E801A20"/>
@@ -5646,7 +6767,7 @@
       </w:pPr>
     </w:lvl>
   </w:abstractNum>
-  <w:abstractNum w:abstractNumId="2" w15:restartNumberingAfterBreak="0">
+  <w:abstractNum w:abstractNumId="3" w15:restartNumberingAfterBreak="0">
     <w:nsid w:val="23D4252C"/>
     <w:multiLevelType w:val="hybridMultilevel"/>
     <w:tmpl w:val="94E80684"/>
@@ -5759,7 +6880,120 @@
       </w:rPr>
     </w:lvl>
   </w:abstractNum>
-  <w:abstractNum w:abstractNumId="3" w15:restartNumberingAfterBreak="0">
+  <w:abstractNum w:abstractNumId="4" w15:restartNumberingAfterBreak="0">
+    <w:nsid w:val="36A35075"/>
+    <w:multiLevelType w:val="multilevel"/>
+    <w:tmpl w:val="04090021"/>
+    <w:lvl w:ilvl="0">
+      <w:start w:val="1"/>
+      <w:numFmt w:val="bullet"/>
+      <w:lvlText w:val=""/>
+      <w:lvlJc w:val="left"/>
+      <w:pPr>
+        <w:ind w:left="360" w:hanging="360"/>
+      </w:pPr>
+      <w:rPr>
+        <w:rFonts w:ascii="Wingdings" w:hAnsi="Wingdings" w:hint="default"/>
+      </w:rPr>
+    </w:lvl>
+    <w:lvl w:ilvl="1">
+      <w:start w:val="1"/>
+      <w:numFmt w:val="bullet"/>
+      <w:lvlText w:val=""/>
+      <w:lvlJc w:val="left"/>
+      <w:pPr>
+        <w:ind w:left="720" w:hanging="360"/>
+      </w:pPr>
+      <w:rPr>
+        <w:rFonts w:ascii="Wingdings" w:hAnsi="Wingdings" w:hint="default"/>
+      </w:rPr>
+    </w:lvl>
+    <w:lvl w:ilvl="2">
+      <w:start w:val="1"/>
+      <w:numFmt w:val="bullet"/>
+      <w:lvlText w:val=""/>
+      <w:lvlJc w:val="left"/>
+      <w:pPr>
+        <w:ind w:left="1080" w:hanging="360"/>
+      </w:pPr>
+      <w:rPr>
+        <w:rFonts w:ascii="Wingdings" w:hAnsi="Wingdings" w:hint="default"/>
+      </w:rPr>
+    </w:lvl>
+    <w:lvl w:ilvl="3">
+      <w:start w:val="1"/>
+      <w:numFmt w:val="bullet"/>
+      <w:lvlText w:val=""/>
+      <w:lvlJc w:val="left"/>
+      <w:pPr>
+        <w:ind w:left="1440" w:hanging="360"/>
+      </w:pPr>
+      <w:rPr>
+        <w:rFonts w:ascii="Symbol" w:hAnsi="Symbol" w:hint="default"/>
+      </w:rPr>
+    </w:lvl>
+    <w:lvl w:ilvl="4">
+      <w:start w:val="1"/>
+      <w:numFmt w:val="bullet"/>
+      <w:lvlText w:val=""/>
+      <w:lvlJc w:val="left"/>
+      <w:pPr>
+        <w:ind w:left="1800" w:hanging="360"/>
+      </w:pPr>
+      <w:rPr>
+        <w:rFonts w:ascii="Symbol" w:hAnsi="Symbol" w:hint="default"/>
+      </w:rPr>
+    </w:lvl>
+    <w:lvl w:ilvl="5">
+      <w:start w:val="1"/>
+      <w:numFmt w:val="bullet"/>
+      <w:lvlText w:val=""/>
+      <w:lvlJc w:val="left"/>
+      <w:pPr>
+        <w:ind w:left="2160" w:hanging="360"/>
+      </w:pPr>
+      <w:rPr>
+        <w:rFonts w:ascii="Wingdings" w:hAnsi="Wingdings" w:hint="default"/>
+      </w:rPr>
+    </w:lvl>
+    <w:lvl w:ilvl="6">
+      <w:start w:val="1"/>
+      <w:numFmt w:val="bullet"/>
+      <w:lvlText w:val=""/>
+      <w:lvlJc w:val="left"/>
+      <w:pPr>
+        <w:ind w:left="2520" w:hanging="360"/>
+      </w:pPr>
+      <w:rPr>
+        <w:rFonts w:ascii="Wingdings" w:hAnsi="Wingdings" w:hint="default"/>
+      </w:rPr>
+    </w:lvl>
+    <w:lvl w:ilvl="7">
+      <w:start w:val="1"/>
+      <w:numFmt w:val="bullet"/>
+      <w:lvlText w:val=""/>
+      <w:lvlJc w:val="left"/>
+      <w:pPr>
+        <w:ind w:left="2880" w:hanging="360"/>
+      </w:pPr>
+      <w:rPr>
+        <w:rFonts w:ascii="Symbol" w:hAnsi="Symbol" w:hint="default"/>
+      </w:rPr>
+    </w:lvl>
+    <w:lvl w:ilvl="8">
+      <w:start w:val="1"/>
+      <w:numFmt w:val="bullet"/>
+      <w:lvlText w:val=""/>
+      <w:lvlJc w:val="left"/>
+      <w:pPr>
+        <w:ind w:left="3240" w:hanging="360"/>
+      </w:pPr>
+      <w:rPr>
+        <w:rFonts w:ascii="Symbol" w:hAnsi="Symbol" w:hint="default"/>
+      </w:rPr>
+    </w:lvl>
+  </w:abstractNum>
+  <w:abstractNum w:abstractNumId="5" w15:restartNumberingAfterBreak="0">
     <w:nsid w:val="42B0101A"/>
     <w:multiLevelType w:val="multilevel"/>
     <w:tmpl w:val="04090021"/>
@@ -5872,7 +7106,119 @@
       </w:rPr>
     </w:lvl>
   </w:abstractNum>
-  <w:abstractNum w:abstractNumId="4" w15:restartNumberingAfterBreak="0">
+  <w:abstractNum w:abstractNumId="6" w15:restartNumberingAfterBreak="0">
+    <w:nsid w:val="480D5012"/>
+    <w:multiLevelType w:val="hybridMultilevel"/>
+    <w:tmpl w:val="662E76AE"/>
+    <w:lvl w:ilvl="0" w:tplc="14708922">
+      <w:numFmt w:val="bullet"/>
+      <w:lvlText w:val="-"/>
+      <w:lvlJc w:val="left"/>
+      <w:pPr>
+        <w:ind w:left="2160" w:hanging="360"/>
+      </w:pPr>
+      <w:rPr>
+        <w:rFonts w:ascii="Calibri" w:eastAsiaTheme="minorHAnsi" w:hAnsi="Calibri" w:cs="Calibri" w:hint="default"/>
+      </w:rPr>
+    </w:lvl>
+    <w:lvl w:ilvl="1" w:tplc="04090003" w:tentative="1">
+      <w:start w:val="1"/>
+      <w:numFmt w:val="bullet"/>
+      <w:lvlText w:val="o"/>
+      <w:lvlJc w:val="left"/>
+      <w:pPr>
+        <w:ind w:left="2880" w:hanging="360"/>
+      </w:pPr>
+      <w:rPr>
+        <w:rFonts w:ascii="Courier New" w:hAnsi="Courier New" w:cs="Courier New" w:hint="default"/>
+      </w:rPr>
+    </w:lvl>
+    <w:lvl w:ilvl="2" w:tplc="04090005" w:tentative="1">
+      <w:start w:val="1"/>
+      <w:numFmt w:val="bullet"/>
+      <w:lvlText w:val=""/>
+      <w:lvlJc w:val="left"/>
+      <w:pPr>
+        <w:ind w:left="3600" w:hanging="360"/>
+      </w:pPr>
+      <w:rPr>
+        <w:rFonts w:ascii="Wingdings" w:hAnsi="Wingdings" w:hint="default"/>
+      </w:rPr>
+    </w:lvl>
+    <w:lvl w:ilvl="3" w:tplc="04090001" w:tentative="1">
+      <w:start w:val="1"/>
+      <w:numFmt w:val="bullet"/>
+      <w:lvlText w:val=""/>
+      <w:lvlJc w:val="left"/>
+      <w:pPr>
+        <w:ind w:left="4320" w:hanging="360"/>
+      </w:pPr>
+      <w:rPr>
+        <w:rFonts w:ascii="Symbol" w:hAnsi="Symbol" w:hint="default"/>
+      </w:rPr>
+    </w:lvl>
+    <w:lvl w:ilvl="4" w:tplc="04090003" w:tentative="1">
+      <w:start w:val="1"/>
+      <w:numFmt w:val="bullet"/>
+      <w:lvlText w:val="o"/>
+      <w:lvlJc w:val="left"/>
+      <w:pPr>
+        <w:ind w:left="5040" w:hanging="360"/>
+      </w:pPr>
+      <w:rPr>
+        <w:rFonts w:ascii="Courier New" w:hAnsi="Courier New" w:cs="Courier New" w:hint="default"/>
+      </w:rPr>
+    </w:lvl>
+    <w:lvl w:ilvl="5" w:tplc="04090005" w:tentative="1">
+      <w:start w:val="1"/>
+      <w:numFmt w:val="bullet"/>
+      <w:lvlText w:val=""/>
+      <w:lvlJc w:val="left"/>
+      <w:pPr>
+        <w:ind w:left="5760" w:hanging="360"/>
+      </w:pPr>
+      <w:rPr>
+        <w:rFonts w:ascii="Wingdings" w:hAnsi="Wingdings" w:hint="default"/>
+      </w:rPr>
+    </w:lvl>
+    <w:lvl w:ilvl="6" w:tplc="04090001" w:tentative="1">
+      <w:start w:val="1"/>
+      <w:numFmt w:val="bullet"/>
+      <w:lvlText w:val=""/>
+      <w:lvlJc w:val="left"/>
+      <w:pPr>
+        <w:ind w:left="6480" w:hanging="360"/>
+      </w:pPr>
+      <w:rPr>
+        <w:rFonts w:ascii="Symbol" w:hAnsi="Symbol" w:hint="default"/>
+      </w:rPr>
+    </w:lvl>
+    <w:lvl w:ilvl="7" w:tplc="04090003" w:tentative="1">
+      <w:start w:val="1"/>
+      <w:numFmt w:val="bullet"/>
+      <w:lvlText w:val="o"/>
+      <w:lvlJc w:val="left"/>
+      <w:pPr>
+        <w:ind w:left="7200" w:hanging="360"/>
+      </w:pPr>
+      <w:rPr>
+        <w:rFonts w:ascii="Courier New" w:hAnsi="Courier New" w:cs="Courier New" w:hint="default"/>
+      </w:rPr>
+    </w:lvl>
+    <w:lvl w:ilvl="8" w:tplc="04090005" w:tentative="1">
+      <w:start w:val="1"/>
+      <w:numFmt w:val="bullet"/>
+      <w:lvlText w:val=""/>
+      <w:lvlJc w:val="left"/>
+      <w:pPr>
+        <w:ind w:left="7920" w:hanging="360"/>
+      </w:pPr>
+      <w:rPr>
+        <w:rFonts w:ascii="Wingdings" w:hAnsi="Wingdings" w:hint="default"/>
+      </w:rPr>
+    </w:lvl>
+  </w:abstractNum>
+  <w:abstractNum w:abstractNumId="7" w15:restartNumberingAfterBreak="0">
     <w:nsid w:val="487325FA"/>
     <w:multiLevelType w:val="multilevel"/>
     <w:tmpl w:val="04090021"/>
@@ -5985,7 +7331,7 @@
       </w:rPr>
     </w:lvl>
   </w:abstractNum>
-  <w:abstractNum w:abstractNumId="5" w15:restartNumberingAfterBreak="0">
+  <w:abstractNum w:abstractNumId="8" w15:restartNumberingAfterBreak="0">
     <w:nsid w:val="491E37B2"/>
     <w:multiLevelType w:val="hybridMultilevel"/>
     <w:tmpl w:val="C35063CA"/>
@@ -6074,7 +7420,93 @@
       </w:pPr>
     </w:lvl>
   </w:abstractNum>
-  <w:abstractNum w:abstractNumId="6" w15:restartNumberingAfterBreak="0">
+  <w:abstractNum w:abstractNumId="9" w15:restartNumberingAfterBreak="0">
+    <w:nsid w:val="4C0349D1"/>
+    <w:multiLevelType w:val="multilevel"/>
+    <w:tmpl w:val="0409001D"/>
+    <w:lvl w:ilvl="0">
+      <w:start w:val="1"/>
+      <w:numFmt w:val="decimal"/>
+      <w:lvlText w:val="%1)"/>
+      <w:lvlJc w:val="left"/>
+      <w:pPr>
+        <w:ind w:left="360" w:hanging="360"/>
+      </w:pPr>
+    </w:lvl>
+    <w:lvl w:ilvl="1">
+      <w:start w:val="1"/>
+      <w:numFmt w:val="lowerLetter"/>
+      <w:lvlText w:val="%2)"/>
+      <w:lvlJc w:val="left"/>
+      <w:pPr>
+        <w:ind w:left="720" w:hanging="360"/>
+      </w:pPr>
+    </w:lvl>
+    <w:lvl w:ilvl="2">
+      <w:start w:val="1"/>
+      <w:numFmt w:val="lowerRoman"/>
+      <w:lvlText w:val="%3)"/>
+      <w:lvlJc w:val="left"/>
+      <w:pPr>
+        <w:ind w:left="1080" w:hanging="360"/>
+      </w:pPr>
+    </w:lvl>
+    <w:lvl w:ilvl="3">
+      <w:start w:val="1"/>
+      <w:numFmt w:val="decimal"/>
+      <w:lvlText w:val="(%4)"/>
+      <w:lvlJc w:val="left"/>
+      <w:pPr>
+        <w:ind w:left="1440" w:hanging="360"/>
+      </w:pPr>
+    </w:lvl>
+    <w:lvl w:ilvl="4">
+      <w:start w:val="1"/>
+      <w:numFmt w:val="lowerLetter"/>
+      <w:lvlText w:val="(%5)"/>
+      <w:lvlJc w:val="left"/>
+      <w:pPr>
+        <w:ind w:left="1800" w:hanging="360"/>
+      </w:pPr>
+    </w:lvl>
+    <w:lvl w:ilvl="5">
+      <w:start w:val="1"/>
+      <w:numFmt w:val="lowerRoman"/>
+      <w:lvlText w:val="(%6)"/>
+      <w:lvlJc w:val="left"/>
+      <w:pPr>
+        <w:ind w:left="2160" w:hanging="360"/>
+      </w:pPr>
+    </w:lvl>
+    <w:lvl w:ilvl="6">
+      <w:start w:val="1"/>
+      <w:numFmt w:val="decimal"/>
+      <w:lvlText w:val="%7."/>
+      <w:lvlJc w:val="left"/>
+      <w:pPr>
+        <w:ind w:left="2520" w:hanging="360"/>
+      </w:pPr>
+    </w:lvl>
+    <w:lvl w:ilvl="7">
+      <w:start w:val="1"/>
+      <w:numFmt w:val="lowerLetter"/>
+      <w:lvlText w:val="%8."/>
+      <w:lvlJc w:val="left"/>
+      <w:pPr>
+        <w:ind w:left="2880" w:hanging="360"/>
+      </w:pPr>
+    </w:lvl>
+    <w:lvl w:ilvl="8">
+      <w:start w:val="1"/>
+      <w:numFmt w:val="lowerRoman"/>
+      <w:lvlText w:val="%9."/>
+      <w:lvlJc w:val="left"/>
+      <w:pPr>
+        <w:ind w:left="3240" w:hanging="360"/>
+      </w:pPr>
+    </w:lvl>
+  </w:abstractNum>
+  <w:abstractNum w:abstractNumId="10" w15:restartNumberingAfterBreak="0">
     <w:nsid w:val="57FC21AC"/>
     <w:multiLevelType w:val="multilevel"/>
     <w:tmpl w:val="913631A8"/>
@@ -6187,7 +7619,7 @@
       </w:rPr>
     </w:lvl>
   </w:abstractNum>
-  <w:abstractNum w:abstractNumId="7" w15:restartNumberingAfterBreak="0">
+  <w:abstractNum w:abstractNumId="11" w15:restartNumberingAfterBreak="0">
     <w:nsid w:val="64EE50BD"/>
     <w:multiLevelType w:val="multilevel"/>
     <w:tmpl w:val="04090021"/>
@@ -6300,7 +7732,120 @@
       </w:rPr>
     </w:lvl>
   </w:abstractNum>
-  <w:abstractNum w:abstractNumId="8" w15:restartNumberingAfterBreak="0">
+  <w:abstractNum w:abstractNumId="12" w15:restartNumberingAfterBreak="0">
+    <w:nsid w:val="6F3E7D06"/>
+    <w:multiLevelType w:val="multilevel"/>
+    <w:tmpl w:val="04090021"/>
+    <w:lvl w:ilvl="0">
+      <w:start w:val="1"/>
+      <w:numFmt w:val="bullet"/>
+      <w:lvlText w:val=""/>
+      <w:lvlJc w:val="left"/>
+      <w:pPr>
+        <w:ind w:left="360" w:hanging="360"/>
+      </w:pPr>
+      <w:rPr>
+        <w:rFonts w:ascii="Wingdings" w:hAnsi="Wingdings" w:hint="default"/>
+      </w:rPr>
+    </w:lvl>
+    <w:lvl w:ilvl="1">
+      <w:start w:val="1"/>
+      <w:numFmt w:val="bullet"/>
+      <w:lvlText w:val=""/>
+      <w:lvlJc w:val="left"/>
+      <w:pPr>
+        <w:ind w:left="720" w:hanging="360"/>
+      </w:pPr>
+      <w:rPr>
+        <w:rFonts w:ascii="Wingdings" w:hAnsi="Wingdings" w:hint="default"/>
+      </w:rPr>
+    </w:lvl>
+    <w:lvl w:ilvl="2">
+      <w:start w:val="1"/>
+      <w:numFmt w:val="bullet"/>
+      <w:lvlText w:val=""/>
+      <w:lvlJc w:val="left"/>
+      <w:pPr>
+        <w:ind w:left="1080" w:hanging="360"/>
+      </w:pPr>
+      <w:rPr>
+        <w:rFonts w:ascii="Wingdings" w:hAnsi="Wingdings" w:hint="default"/>
+      </w:rPr>
+    </w:lvl>
+    <w:lvl w:ilvl="3">
+      <w:start w:val="1"/>
+      <w:numFmt w:val="bullet"/>
+      <w:lvlText w:val=""/>
+      <w:lvlJc w:val="left"/>
+      <w:pPr>
+        <w:ind w:left="1440" w:hanging="360"/>
+      </w:pPr>
+      <w:rPr>
+        <w:rFonts w:ascii="Symbol" w:hAnsi="Symbol" w:hint="default"/>
+      </w:rPr>
+    </w:lvl>
+    <w:lvl w:ilvl="4">
+      <w:start w:val="1"/>
+      <w:numFmt w:val="bullet"/>
+      <w:lvlText w:val=""/>
+      <w:lvlJc w:val="left"/>
+      <w:pPr>
+        <w:ind w:left="1800" w:hanging="360"/>
+      </w:pPr>
+      <w:rPr>
+        <w:rFonts w:ascii="Symbol" w:hAnsi="Symbol" w:hint="default"/>
+      </w:rPr>
+    </w:lvl>
+    <w:lvl w:ilvl="5">
+      <w:start w:val="1"/>
+      <w:numFmt w:val="bullet"/>
+      <w:lvlText w:val=""/>
+      <w:lvlJc w:val="left"/>
+      <w:pPr>
+        <w:ind w:left="2160" w:hanging="360"/>
+      </w:pPr>
+      <w:rPr>
+        <w:rFonts w:ascii="Wingdings" w:hAnsi="Wingdings" w:hint="default"/>
+      </w:rPr>
+    </w:lvl>
+    <w:lvl w:ilvl="6">
+      <w:start w:val="1"/>
+      <w:numFmt w:val="bullet"/>
+      <w:lvlText w:val=""/>
+      <w:lvlJc w:val="left"/>
+      <w:pPr>
+        <w:ind w:left="2520" w:hanging="360"/>
+      </w:pPr>
+      <w:rPr>
+        <w:rFonts w:ascii="Wingdings" w:hAnsi="Wingdings" w:hint="default"/>
+      </w:rPr>
+    </w:lvl>
+    <w:lvl w:ilvl="7">
+      <w:start w:val="1"/>
+      <w:numFmt w:val="bullet"/>
+      <w:lvlText w:val=""/>
+      <w:lvlJc w:val="left"/>
+      <w:pPr>
+        <w:ind w:left="2880" w:hanging="360"/>
+      </w:pPr>
+      <w:rPr>
+        <w:rFonts w:ascii="Symbol" w:hAnsi="Symbol" w:hint="default"/>
+      </w:rPr>
+    </w:lvl>
+    <w:lvl w:ilvl="8">
+      <w:start w:val="1"/>
+      <w:numFmt w:val="bullet"/>
+      <w:lvlText w:val=""/>
+      <w:lvlJc w:val="left"/>
+      <w:pPr>
+        <w:ind w:left="3240" w:hanging="360"/>
+      </w:pPr>
+      <w:rPr>
+        <w:rFonts w:ascii="Symbol" w:hAnsi="Symbol" w:hint="default"/>
+      </w:rPr>
+    </w:lvl>
+  </w:abstractNum>
+  <w:abstractNum w:abstractNumId="13" w15:restartNumberingAfterBreak="0">
     <w:nsid w:val="70F24483"/>
     <w:multiLevelType w:val="hybridMultilevel"/>
     <w:tmpl w:val="540E136E"/>
@@ -6386,7 +7931,7 @@
       </w:pPr>
     </w:lvl>
   </w:abstractNum>
-  <w:abstractNum w:abstractNumId="9" w15:restartNumberingAfterBreak="0">
+  <w:abstractNum w:abstractNumId="14" w15:restartNumberingAfterBreak="0">
     <w:nsid w:val="787745EA"/>
     <w:multiLevelType w:val="multilevel"/>
     <w:tmpl w:val="913631A8"/>
@@ -6500,34 +8045,49 @@
     </w:lvl>
   </w:abstractNum>
   <w:num w:numId="1">
-    <w:abstractNumId w:val="6"/>
+    <w:abstractNumId w:val="10"/>
   </w:num>
   <w:num w:numId="2">
-    <w:abstractNumId w:val="4"/>
+    <w:abstractNumId w:val="7"/>
   </w:num>
   <w:num w:numId="3">
-    <w:abstractNumId w:val="3"/>
+    <w:abstractNumId w:val="5"/>
   </w:num>
   <w:num w:numId="4">
-    <w:abstractNumId w:val="1"/>
+    <w:abstractNumId w:val="2"/>
   </w:num>
   <w:num w:numId="5">
-    <w:abstractNumId w:val="5"/>
+    <w:abstractNumId w:val="8"/>
   </w:num>
   <w:num w:numId="6">
-    <w:abstractNumId w:val="8"/>
+    <w:abstractNumId w:val="13"/>
   </w:num>
   <w:num w:numId="7">
-    <w:abstractNumId w:val="2"/>
+    <w:abstractNumId w:val="3"/>
   </w:num>
   <w:num w:numId="8">
     <w:abstractNumId w:val="0"/>
   </w:num>
   <w:num w:numId="9">
+    <w:abstractNumId w:val="14"/>
+  </w:num>
+  <w:num w:numId="10">
+    <w:abstractNumId w:val="11"/>
+  </w:num>
+  <w:num w:numId="11">
+    <w:abstractNumId w:val="1"/>
+  </w:num>
+  <w:num w:numId="12">
     <w:abstractNumId w:val="9"/>
   </w:num>
-  <w:num w:numId="10">
-    <w:abstractNumId w:val="7"/>
+  <w:num w:numId="13">
+    <w:abstractNumId w:val="6"/>
+  </w:num>
+  <w:num w:numId="14">
+    <w:abstractNumId w:val="12"/>
+  </w:num>
+  <w:num w:numId="15">
+    <w:abstractNumId w:val="4"/>
   </w:num>
 </w:numbering>
 </file>

</xml_diff>